<commit_message>
Correct final method and prompt provenance
</commit_message>
<xml_diff>
--- a/output/Income_Gaps_VLM_Short_Paper.docx
+++ b/output/Income_Gaps_VLM_Short_Paper.docx
@@ -114,7 +114,7 @@
         <w:rPr>
           <w:i w:val="0"/>
         </w:rPr>
-        <w:t>CLIP used its checkpoint processor (short-edge resize to 224 pixels and 224 x 224 centre crop); BLIP used its 384 x 384 processor. Qwen used a fixed 256-visual-token budget (200,704 pixels). InternVL used its checkpoint dynamic image preprocessing. YOLO-World retained aspect ratio through its model preprocessing. The fixed manifest, image IDs, prompts, outputs, and run metadata are saved in the repository.</w:t>
+        <w:t>CLIP used its checkpoint processor (short-edge resize to 224 pixels and 224 x 224 centre crop); BLIP used its 384 x 384 processor. Qwen used a fixed 256-visual-token budget (200,704 pixels). InternVL resized each RGB image to 448 x 448 with bicubic interpolation, converted it to a tensor, and applied ImageNet mean and standard-deviation normalization. YOLO-World received the RGB array through the standard Ultralytics prediction pipeline. The fixed manifest, image IDs, prompts, outputs, and run metadata are saved in the repository.</w:t>
       </w:r>
     </w:p>
     <w:p>
@@ -135,7 +135,7 @@
         <w:rPr>
           <w:i w:val="0"/>
         </w:rPr>
-        <w:t>CLIP ViT-B/32 (Radford et al., 2021) performed six-way zero-shot classification with the proposal prompt a photo of a household {label}. The exact prompt was rerun after integration; this corrected run supersedes the earlier pilot wording. BLIP-base (Li et al., 2022) generated an unprompted caption and a caption starting with the label-free prefix the main household object in this image is.</w:t>
+        <w:t>CLIP ViT-B/32 (Radford et al., 2021) performed six-way zero-shot classification with the proposal template a photo of a {label}. The exact template was rerun after integration; this corrected run supersedes the earlier pilot wording. BLIP-base (Li et al., 2022) generated an unprompted caption and a caption starting with the label-free prefix the main household object in this image is.</w:t>
       </w:r>
     </w:p>
     <w:p>

</xml_diff>

<commit_message>
Use full pages in final paper layout
</commit_message>
<xml_diff>
--- a/output/Income_Gaps_VLM_Short_Paper.docx
+++ b/output/Income_Gaps_VLM_Short_Paper.docx
@@ -183,11 +183,6 @@
           <w:i w:val="0"/>
         </w:rPr>
         <w:t>For every condition we report overall, quartile, and category scores. The primary gap is Q4 minus Q1 with a 95% category-stratified bootstrap interval from 2,000 resamples using seed 2026. All 1,344 prediction rows were checked for complete coverage, unique image-model-task keys, and non-missing metrics. Experiments used public checkpoints; CLIP, BLIP, Qwen, and YOLO-World ran locally, while InternVL ran on CUDA.</w:t>
-      </w:r>
-    </w:p>
-    <w:p>
-      <w:r>
-        <w:br w:type="page"/>
       </w:r>
     </w:p>
     <w:p>
@@ -2181,6 +2176,60 @@
     </w:p>
     <w:p>
       <w:pPr>
+        <w:keepNext/>
+        <w:spacing w:after="20"/>
+        <w:jc w:val="center"/>
+      </w:pPr>
+      <w:r>
+        <w:drawing>
+          <wp:inline xmlns:a="http://schemas.openxmlformats.org/drawingml/2006/main" xmlns:pic="http://schemas.openxmlformats.org/drawingml/2006/picture">
+            <wp:extent cx="6309360" cy="1591008"/>
+            <wp:docPr id="2" name="Picture 2"/>
+            <wp:cNvGraphicFramePr>
+              <a:graphicFrameLocks noChangeAspect="1"/>
+            </wp:cNvGraphicFramePr>
+            <a:graphic>
+              <a:graphicData uri="http://schemas.openxmlformats.org/drawingml/2006/picture">
+                <pic:pic>
+                  <pic:nvPicPr>
+                    <pic:cNvPr id="0" name="qualitative_examples.png"/>
+                    <pic:cNvPicPr/>
+                  </pic:nvPicPr>
+                  <pic:blipFill>
+                    <a:blip r:embed="rId11"/>
+                    <a:stretch>
+                      <a:fillRect/>
+                    </a:stretch>
+                  </pic:blipFill>
+                  <pic:spPr>
+                    <a:xfrm>
+                      <a:off x="0" y="0"/>
+                      <a:ext cx="6309360" cy="1591008"/>
+                    </a:xfrm>
+                    <a:prstGeom prst="rect"/>
+                  </pic:spPr>
+                </pic:pic>
+              </a:graphicData>
+            </a:graphic>
+          </wp:inline>
+        </w:drawing>
+      </w:r>
+    </w:p>
+    <w:p>
+      <w:pPr>
+        <w:keepLines w:val="0"/>
+        <w:spacing w:after="50" w:line="240" w:lineRule="auto"/>
+        <w:jc w:val="both"/>
+      </w:pPr>
+      <w:r>
+        <w:rPr>
+          <w:i/>
+        </w:rPr>
+        <w:t>Figure 2. Qualitative evidence from the Gradio demo: a shared CLIP/BLIP footwear success, correct YOLO-World footwear localization, and a culturally specific fuel-can case where the source label and visible form are difficult to align.</w:t>
+      </w:r>
+    </w:p>
+    <w:p>
+      <w:pPr>
         <w:pStyle w:val="Heading1"/>
       </w:pPr>
       <w:r>

</xml_diff>

<commit_message>
Format final paper in CVPR 2026 style
</commit_message>
<xml_diff>
--- a/output/Income_Gaps_VLM_Short_Paper.docx
+++ b/output/Income_Gaps_VLM_Short_Paper.docx
@@ -31,22 +31,10 @@
     </w:p>
     <w:p>
       <w:pPr>
-        <w:spacing w:after="100"/>
-        <w:jc w:val="center"/>
-      </w:pPr>
-      <w:r>
-        <w:rPr>
-          <w:sz w:val="16"/>
-        </w:rPr>
-        <w:t>Computer Vision Project Short Paper</w:t>
-      </w:r>
-    </w:p>
-    <w:p>
-      <w:pPr>
         <w:pStyle w:val="Heading1"/>
       </w:pPr>
       <w:r>
-        <w:t>1 Introduction and problem motivation</w:t>
+        <w:t>Abstract</w:t>
       </w:r>
     </w:p>
     <w:p>
@@ -59,7 +47,15 @@
         <w:rPr>
           <w:i w:val="0"/>
         </w:rPr>
-        <w:t>Household objects do not have one standard appearance. A stove may be a built-in appliance, a portable gas burner, or a solid-fuel setup; roofs, switches, light sources, footwear, and waste containers also vary across homes. Models trained mainly on web image-text pairs may recognize familiar forms more reliably than less common ones. Nwatu et al. (2023) reported income-related differences in CLIP alignment and retrieval on Dollar Street. We extend that question to classification, caption generation, and open-vocabulary detection.</w:t>
+        <w:t>We study whether pretrained vision-language models perform differently on pictures of household objects from four income groups in Dollar Street. The benchmark contains 168 images from six categories, with seven images in every category-income cell. We compare CLIP, BLIP, Qwen2.5-VL, InternVL3.5, and YOLO-World without fine-tuning. CLIP classification and every automatic caption measure scored higher on the highest-income quartile than the lowest, while Qwen and InternVL classification changed little. A two-rater review also showed that vocabulary matching understated BLIP caption quality. The measured gap depends on the model, task, and evaluation metric.</w:t>
+      </w:r>
+    </w:p>
+    <w:p>
+      <w:pPr>
+        <w:pStyle w:val="Heading1"/>
+      </w:pPr>
+      <w:r>
+        <w:t>1 Introduction</w:t>
       </w:r>
     </w:p>
     <w:p>
@@ -72,7 +68,7 @@
         <w:rPr>
           <w:i w:val="0"/>
         </w:rPr>
-        <w:t>We ask: How does pretrained model performance on six household-object categories vary across four Dollar Street income quartiles when category frequency is held constant? We test CLIP, BLIP, Qwen2.5-VL, InternVL3.5, and YOLO-World without training or fine-tuning. The aim is a controlled benchmark, not a claim that income causes model errors.</w:t>
+        <w:t>The same household object can look very different across homes. For example, a stove may be built into a kitchen, placed on a table, or use solid fuel. Models trained largely on web image-text pairs may be more familiar with some of these forms than others. Earlier Dollar Street work found income-related differences in CLIP alignment and retrieval [4]. We ask: How does performance on six household-object categories vary across four income quartiles when each category is equally represented? Income is used to group images; it is not treated as the cause of an error.</w:t>
       </w:r>
     </w:p>
     <w:p>
@@ -80,7 +76,7 @@
         <w:pStyle w:val="Heading1"/>
       </w:pPr>
       <w:r>
-        <w:t>2 Methodology</w:t>
+        <w:t>2 Method</w:t>
       </w:r>
     </w:p>
     <w:p>
@@ -88,7 +84,7 @@
         <w:pStyle w:val="Heading2"/>
       </w:pPr>
       <w:r>
-        <w:t>2.1 Dataset and preprocessing</w:t>
+        <w:t>Dataset</w:t>
       </w:r>
     </w:p>
     <w:p>
@@ -101,7 +97,15 @@
         <w:rPr>
           <w:i w:val="0"/>
         </w:rPr>
-        <w:t>We used the 1,600-row public Dollar Street test split (Rojas et al., 2022). Income is monthly consumption per adult equivalent in PPP-adjusted US dollars, not salary. After excluding 45 multi-label rows, quartiles were calculated over 1,555 eligible records: Q1 &lt;= 210.67, Q2 &lt;= 685, Q3 &lt;= 1,841, and Q4 &gt; 1,841. A deterministic subset contains 168 unique images from 44 countries and six categories: roof, light source, stove, trash container, switch, and footwear. Every one of the 24 category-quartile cells contains seven images, giving 42 images per quartile and 28 per category. This removes category-frequency imbalance from the income comparison but does not make the subset population-representative. Regional counts are unequal, so region is not used as a primary comparison.</w:t>
+        <w:t>We used the public 1,600-row Dollar Street test split [6]. Income records monthly consumption per adult equivalent in PPP-adjusted US dollars. After removing 45 multi-label rows, we formed quartiles from 1,555 eligible records. The evaluation subset contains 168 images from 44 countries and six categories: roof, light source, stove, trash container, switch, and footwear. Each of the 24 category-quartile cells has seven images. This controls category frequency, although the subset is not representative of the whole population and regional counts remain unequal.</w:t>
+      </w:r>
+    </w:p>
+    <w:p>
+      <w:pPr>
+        <w:pStyle w:val="Heading2"/>
+      </w:pPr>
+      <w:r>
+        <w:t>Models and tasks</w:t>
       </w:r>
     </w:p>
     <w:p>
@@ -114,15 +118,7 @@
         <w:rPr>
           <w:i w:val="0"/>
         </w:rPr>
-        <w:t>CLIP used its checkpoint processor (short-edge resize to 224 pixels and 224 x 224 centre crop); BLIP used its 384 x 384 processor. Qwen used a fixed 256-visual-token budget (200,704 pixels). InternVL resized each RGB image to 448 x 448 with bicubic interpolation, converted it to a tensor, and applied ImageNet mean and standard-deviation normalization. YOLO-World received the RGB array through the standard Ultralytics prediction pipeline. The fixed manifest, image IDs, prompts, outputs, and run metadata are saved in the repository.</w:t>
-      </w:r>
-    </w:p>
-    <w:p>
-      <w:pPr>
-        <w:pStyle w:val="Heading2"/>
-      </w:pPr>
-      <w:r>
-        <w:t>2.2 Models and tasks</w:t>
+        <w:t>CLIP ViT-B/32 [5] performed six-way zero-shot classification with a photo of a {label}. BLIP-base [3] generated an unprompted caption and a caption beginning with the label-free prefix the main household object in this image is. Qwen2.5-VL-3B-Instruct [1] and InternVL3.5-2B [7] used the same forced-choice classification instruction and the same short, location-neutral caption instruction. YOLO-World-small-v2 [2] received the six labels with a confidence threshold of 0.25. Since Dollar Street has no bounding boxes, YOLO-World is reported as an image-level correct-class detection rate; mAP and IoU cannot be calculated.</w:t>
       </w:r>
     </w:p>
     <w:p>
@@ -135,7 +131,15 @@
         <w:rPr>
           <w:i w:val="0"/>
         </w:rPr>
-        <w:t>CLIP ViT-B/32 (Radford et al., 2021) performed six-way zero-shot classification with the proposal template a photo of a {label}. The exact template was rerun after integration; this corrected run supersedes the earlier pilot wording. BLIP-base (Li et al., 2022) generated an unprompted caption and a caption starting with the label-free prefix the main household object in this image is.</w:t>
+        <w:t>CLIP used its 224-pixel checkpoint processor and BLIP its 384-pixel processor. Qwen used a 256-token visual budget, InternVL used 448 by 448 RGB inputs with ImageNet normalization, and YOLO-World used the Ultralytics prediction pipeline. Generation was deterministic. The manifest, image identifiers, prompts, outputs, and run settings are included in the repository.</w:t>
+      </w:r>
+    </w:p>
+    <w:p>
+      <w:pPr>
+        <w:pStyle w:val="Heading2"/>
+      </w:pPr>
+      <w:r>
+        <w:t>Evaluation</w:t>
       </w:r>
     </w:p>
     <w:p>
@@ -148,41 +152,7 @@
         <w:rPr>
           <w:i w:val="0"/>
         </w:rPr>
-        <w:t>Qwen2.5-VL-3B-Instruct (Bai et al., 2025) and InternVL3.5-2B (Wang et al., 2025) used the same forced-choice classification instruction and the same short, location-neutral caption instruction. Decoding was deterministic. YOLO-World-small-v2 (Cheng et al., 2024) received the same six text labels at a fixed 0.25 confidence threshold. Dollar Street has no bounding boxes, so YOLO-World is evaluated only as an image-level correct-class detection baseline; mAP and IoU would be invalid here.</w:t>
-      </w:r>
-    </w:p>
-    <w:p>
-      <w:pPr>
-        <w:pStyle w:val="Heading2"/>
-      </w:pPr>
-      <w:r>
-        <w:t>2.3 Evaluation and reproducibility</w:t>
-      </w:r>
-    </w:p>
-    <w:p>
-      <w:pPr>
-        <w:keepLines w:val="0"/>
-        <w:spacing w:after="50" w:line="240" w:lineRule="auto"/>
-        <w:jc w:val="both"/>
-      </w:pPr>
-      <w:r>
-        <w:rPr>
-          <w:i w:val="0"/>
-        </w:rPr>
-        <w:t>Classification uses top-1 accuracy. Captioning uses accepted-term recall: a caption matches if it includes a predeclared category term or synonym using whole-term matching. Because this narrow vocabulary can miss valid descriptions, two raters independently reviewed all 336 BLIP captions for object correctness, non-informativeness, and hallucination, then adjudicated disagreements. We report raw agreement and Cohen's kappa. A separate deterministic 84-image audit checked Qwen captions. Detection uses image-level correct-class hit rate.</w:t>
-      </w:r>
-    </w:p>
-    <w:p>
-      <w:pPr>
-        <w:keepLines w:val="0"/>
-        <w:spacing w:after="50" w:line="240" w:lineRule="auto"/>
-        <w:jc w:val="both"/>
-      </w:pPr>
-      <w:r>
-        <w:rPr>
-          <w:i w:val="0"/>
-        </w:rPr>
-        <w:t>For every condition we report overall, quartile, and category scores. The primary gap is Q4 minus Q1 with a 95% category-stratified bootstrap interval from 2,000 resamples using seed 2026. All 1,344 prediction rows were checked for complete coverage, unique image-model-task keys, and non-missing metrics. Experiments used public checkpoints; CLIP, BLIP, Qwen, and YOLO-World ran locally, while InternVL ran on CUDA.</w:t>
+        <w:t>Classification uses top-1 accuracy. Caption recall checks for a predefined category term or synonym with whole-term matching. Two raters independently reviewed all 336 BLIP captions for object correctness, non-informativeness, and hallucination, and then resolved disagreements. We report raw agreement and Cohen's kappa. A fixed 84-image sample was also used to check Qwen captions. The main gap is Q4 minus Q1, with a 95% category-stratified bootstrap interval from 2,000 resamples using seed 2026. We verified all 1,344 prediction rows for coverage, duplicate keys, and missing metrics.</w:t>
       </w:r>
     </w:p>
     <w:p>
@@ -2066,7 +2036,7 @@
         <w:rPr>
           <w:i/>
         </w:rPr>
-        <w:t>Table 1. Scores (%) by income quartile; n = 42 images per quartile.</w:t>
+        <w:t>Table 1. Scores (%) by income quartile; each quartile contains 42 images.</w:t>
       </w:r>
     </w:p>
     <w:p>
@@ -2132,7 +2102,7 @@
         <w:rPr>
           <w:i w:val="0"/>
         </w:rPr>
-        <w:t>The three classifiers had similar overall accuracy (86.3-86.9%), but not the same income pattern. CLIP's Q4-Q1 gap was 16.7 percentage points (95% CI 2.4 to 28.6), while Qwen's 2.4-point gap (-7.1 to 14.3) and InternVL's 0.0-point gap (-9.5 to 9.5) included zero. This shows why one model cannot represent the behavior of a whole model family.</w:t>
+        <w:t>All three classifiers had similar overall accuracy, but their quartile results differed. CLIP's Q4-Q1 gap was 16.7 percentage points (95% CI 2.4 to 28.6). The intervals for Qwen's 2.4-point gap (-7.1 to 14.3) and InternVL's zero-point gap (-9.5 to 9.5) included zero. The CLIP pattern did not appear in both instruction-following classifiers.</w:t>
       </w:r>
     </w:p>
     <w:p>
@@ -2145,7 +2115,7 @@
         <w:rPr>
           <w:i w:val="0"/>
         </w:rPr>
-        <w:t>Automatic caption recall increased from Q1 to Q4 for all captioning conditions. Gaps were 47.6 points for BLIP baseline (31.0 to 64.3), 52.4 for prompted BLIP (38.1 to 66.7), 45.2 for Qwen (28.6 to 61.9), and 21.4 for InternVL (4.7 to 38.1). However, the full two-rater BLIP review changed the size of the result: adjudicated object correctness was 80.4% for baseline and 83.9% for prompted captions, compared with automatic recalls of 53.0% and 51.2%. Baseline object correctness rose from 78.6% in Q1 to 88.1% in Q4; prompted correctness rose from 73.8% to 90.5%. The prompt therefore reduced accepted-term recall by 1.8 points but improved human-rated object correctness by 3.6 points and reduced hallucinations from 16.7% to 12.5%. Object-correct agreement was 89.3% with kappa 0.65; hallucination agreement was 94.0% with kappa 0.77. The metric was too narrow to judge caption quality by itself.</w:t>
+        <w:t>Automatic caption recall was higher in Q4 than Q1 for every captioning condition. The gaps were 47.6 points for unprompted BLIP, 52.4 for prompted BLIP, 45.2 for Qwen, and 21.4 for InternVL. Manual review gave a different view of BLIP. Object correctness was 80.4% without the prompt and 83.9% with it, compared with automatic recall of 53.0% and 51.2%. The prompt reduced automatic recall by 1.8 points, but improved human-rated correctness by 3.6 points and reduced hallucinations from 16.7% to 12.5%. Object-correct agreement was 89.3% (kappa 0.65), and hallucination agreement was 94.0% (kappa 0.77). The term list missed reasonable descriptions such as *bucket* or *basket* for a trash container.</w:t>
       </w:r>
     </w:p>
     <w:p>
@@ -2158,74 +2128,7 @@
         <w:rPr>
           <w:i w:val="0"/>
         </w:rPr>
-        <w:t>Category analysis exposed different weaknesses. CLIP was lowest on light sources (60.7%); Qwen and InternVL were lowest on roofs (39.3% and 50.0%). YOLO-World reached 57.1% for footwear and 25.0% for stoves but 0% for roofs, light sources, and switches, producing only 26 correct-class detections overall. This is a useful weak baseline, but its output is not comparable to box-level detector benchmarks because no ground-truth boxes exist.</w:t>
-      </w:r>
-    </w:p>
-    <w:p>
-      <w:pPr>
-        <w:keepLines w:val="0"/>
-        <w:spacing w:after="50" w:line="240" w:lineRule="auto"/>
-        <w:jc w:val="both"/>
-      </w:pPr>
-      <w:r>
-        <w:rPr>
-          <w:i w:val="0"/>
-        </w:rPr>
-        <w:t>Failure cases often involved local object forms and label ambiguity. A small red fuel can was classified by CLIP as a stove while BLIP called it a can, showing that the source label and visible object can support different readings. In another case, a waste container was described as a bucket or basket and counted wrong by the term list despite being understandable. Roof images were sometimes classified as light sources when the roof occupied little of the frame. These examples support manual review and category-level reporting rather than relying only on a single aggregate score.</w:t>
-      </w:r>
-    </w:p>
-    <w:p>
-      <w:pPr>
-        <w:keepNext/>
-        <w:spacing w:after="20"/>
-        <w:jc w:val="center"/>
-      </w:pPr>
-      <w:r>
-        <w:drawing>
-          <wp:inline xmlns:a="http://schemas.openxmlformats.org/drawingml/2006/main" xmlns:pic="http://schemas.openxmlformats.org/drawingml/2006/picture">
-            <wp:extent cx="6309360" cy="1591008"/>
-            <wp:docPr id="2" name="Picture 2"/>
-            <wp:cNvGraphicFramePr>
-              <a:graphicFrameLocks noChangeAspect="1"/>
-            </wp:cNvGraphicFramePr>
-            <a:graphic>
-              <a:graphicData uri="http://schemas.openxmlformats.org/drawingml/2006/picture">
-                <pic:pic>
-                  <pic:nvPicPr>
-                    <pic:cNvPr id="0" name="qualitative_examples.png"/>
-                    <pic:cNvPicPr/>
-                  </pic:nvPicPr>
-                  <pic:blipFill>
-                    <a:blip r:embed="rId11"/>
-                    <a:stretch>
-                      <a:fillRect/>
-                    </a:stretch>
-                  </pic:blipFill>
-                  <pic:spPr>
-                    <a:xfrm>
-                      <a:off x="0" y="0"/>
-                      <a:ext cx="6309360" cy="1591008"/>
-                    </a:xfrm>
-                    <a:prstGeom prst="rect"/>
-                  </pic:spPr>
-                </pic:pic>
-              </a:graphicData>
-            </a:graphic>
-          </wp:inline>
-        </w:drawing>
-      </w:r>
-    </w:p>
-    <w:p>
-      <w:pPr>
-        <w:keepLines w:val="0"/>
-        <w:spacing w:after="50" w:line="240" w:lineRule="auto"/>
-        <w:jc w:val="both"/>
-      </w:pPr>
-      <w:r>
-        <w:rPr>
-          <w:i/>
-        </w:rPr>
-        <w:t>Figure 2. Qualitative evidence from the Gradio demo: a shared CLIP/BLIP footwear success, correct YOLO-World footwear localization, and a culturally specific fuel-can case where the source label and visible form are difficult to align.</w:t>
+        <w:t>The category results also differed by model. CLIP was weakest on light sources (60.7%), while Qwen and InternVL were weakest on roofs (39.3% and 50.0%). YOLO-World found 57.1% of footwear and 25.0% of stoves, but none of the roofs, light sources, or switches. In one failure case, CLIP labelled a small red fuel can as a stove while BLIP described the visible can. In another, a roof occupied little of the frame and was classified as a light source. These examples explain why we report category results and manually review captions.</w:t>
       </w:r>
     </w:p>
     <w:p>
@@ -2246,7 +2149,7 @@
         <w:rPr>
           <w:i w:val="0"/>
         </w:rPr>
-        <w:t>The strongest result is not that every model has the same income gap. CLIP and all automatic caption metrics showed higher Q4 than Q1 performance, but the instruction-following classifiers were nearly flat across quartiles. Caption conclusions also depended strongly on the metric: accepted-term recall exaggerated the BLIP gap because valid cultural synonyms were missed. The unsuccessful automatic prompt result is retained, together with the different human-review result.</w:t>
+        <w:t>The results do not support one common income pattern across all models. CLIP and the automatic caption measures favored Q4, whereas Qwen and InternVL classification were nearly flat. The BLIP comparison also depended on the metric: term recall missed valid wording that the raters accepted.</w:t>
       </w:r>
     </w:p>
     <w:p>
@@ -2259,12 +2162,7 @@
         <w:rPr>
           <w:i w:val="0"/>
         </w:rPr>
-        <w:t>The study is limited to 168 selected images and six categories. Balancing controls category frequency but not country, region, scene complexity, image quality, or within-category visual form. Quartiles are defined within the exposed test split, and the bootstrap interval measures uncertainty for this selected benchmark only. Income is associated with the images but was never shown to a model. Results therefore do not establish that income caused errors and should not be generalized to all households. The Gradio demo supports uploaded images and all five baselines, but it is an illustration of model behavior rather than another evaluation dataset.</w:t>
-      </w:r>
-    </w:p>
-    <w:p>
-      <w:r>
-        <w:br w:type="page"/>
+        <w:t>The study covers 168 selected images and six categories. Balancing removes category-frequency differences but does not control country, region, image quality, scene complexity, or variation within a category. Quartiles are defined within the available test split, and the confidence intervals describe this benchmark only. Models never received income information, so the results show associations in performance and do not establish that income caused the errors. The Gradio interface demonstrates the five models on uploaded images; it is not a second evaluation dataset.</w:t>
       </w:r>
     </w:p>
     <w:p>
@@ -2272,7 +2170,7 @@
         <w:pStyle w:val="Heading1"/>
       </w:pPr>
       <w:r>
-        <w:t>Appendix A Related work and positioning</w:t>
+        <w:t>5 Related work</w:t>
       </w:r>
     </w:p>
     <w:p>
@@ -2285,648 +2183,12 @@
         <w:rPr>
           <w:i w:val="0"/>
         </w:rPr>
-        <w:t>Dollar Street was introduced as a geographically and socioeconomically diverse dataset of household objects with country, region, and income metadata (Rojas et al., 2022). Nwatu et al. (2023) then evaluated CLIP on Dollar Street using image-text alignment and prompt-based retrieval, reporting lower performance for poorer groups. Our study is closest to that work but differs in three ways: it fixes category frequency across four income quartiles, evaluates a six-way recognition task rather than only alignment or retrieval, and compares contrastive, generative, instruction-following, and detection model families on the same images.</w:t>
+        <w:t>Dollar Street provides household-object images with country, region, and income metadata [6]. Nwatu et al. evaluated CLIP alignment and prompt-based retrieval across income groups [4]. We use a category-balanced subset, test six-way recognition and captioning, and compare five model families on the same images. CLIP supplies a direct comparison with earlier work [5], while BLIP adds caption generation [3]. Qwen2.5-VL and InternVL3.5 add compact instruction-following VLMs [1,7], and YOLO-World adds open-vocabulary detection [2]. Our experiment found that a gap observed with one model or automatic metric did not always carry over to another.</w:t>
       </w:r>
     </w:p>
     <w:p>
       <w:pPr>
-        <w:keepLines w:val="0"/>
-        <w:spacing w:after="50" w:line="240" w:lineRule="auto"/>
-        <w:jc w:val="both"/>
-      </w:pPr>
-      <w:r>
-        <w:rPr>
-          <w:i w:val="0"/>
-        </w:rPr>
-        <w:t>CLIP learns aligned image and text representations from large-scale web pairs and enables prompt-based zero-shot recognition (Radford et al., 2021). BLIP combines image-text understanding and generation and improves noisy web supervision through generated-caption filtering (Li et al., 2022). We use CLIP as the direct link to prior Dollar Street work and BLIP as a pretrained captioning baseline; neither is fine-tuned.</w:t>
-      </w:r>
-    </w:p>
-    <w:p>
-      <w:pPr>
-        <w:keepLines w:val="0"/>
-        <w:spacing w:after="50" w:line="240" w:lineRule="auto"/>
-        <w:jc w:val="both"/>
-      </w:pPr>
-      <w:r>
-        <w:rPr>
-          <w:i w:val="0"/>
-        </w:rPr>
-        <w:t>Qwen2.5-VL adds instruction-following visual understanding and flexible image resolution (Bai et al., 2025). InternVL3.5 is a newer multimodal family designed for strong perception and reasoning with efficient deployment variants (Wang et al., 2025). Testing compact public checkpoints under one forced-choice prompt lets us ask whether a CLIP pattern continues in general-purpose VLMs. The answer is mixed: both instruction-following classifiers had much smaller Q4-Q1 differences than CLIP, while their caption metrics still favored Q4.</w:t>
-      </w:r>
-    </w:p>
-    <w:p>
-      <w:pPr>
-        <w:keepLines w:val="0"/>
-        <w:spacing w:after="50" w:line="240" w:lineRule="auto"/>
-        <w:jc w:val="both"/>
-      </w:pPr>
-      <w:r>
-        <w:rPr>
-          <w:i w:val="0"/>
-        </w:rPr>
-        <w:t>YOLO-World performs open-vocabulary detection from text prompts (Cheng et al., 2024). It adds a different computer-vision task and produces qualitative boxes for the demo. Because our source data has image-level labels only, we deliberately report hit rate instead of mAP or IoU. This methodological restriction separates our benchmark from standard object-detection evaluations and prevents unsupported localization claims.</w:t>
-      </w:r>
-    </w:p>
-    <w:p>
-      <w:pPr>
-        <w:keepLines w:val="0"/>
-        <w:spacing w:after="50" w:line="240" w:lineRule="auto"/>
-        <w:jc w:val="both"/>
-      </w:pPr>
-      <w:r>
-        <w:rPr>
-          <w:i w:val="0"/>
-        </w:rPr>
-        <w:t>Our contribution is therefore a controlled cross-model benchmark, not a new architecture or a replication of every prior task. It also shows that conclusions depend on task and evaluation design: the same BLIP prompt looked worse under term recall but better after two-rater semantic review. That finding extends prior socioeconomic evaluation by making metric choice part of the analysis.</w:t>
-      </w:r>
-    </w:p>
-    <w:tbl>
-      <w:tblPr>
-        <w:tblW w:type="auto" w:w="0"/>
-        <w:jc w:val="center"/>
-        <w:tblLayout w:type="fixed"/>
-        <w:tblLook w:firstColumn="1" w:firstRow="1" w:lastColumn="0" w:lastRow="0" w:noHBand="0" w:noVBand="1" w:val="04A0"/>
-      </w:tblPr>
-      <w:tblGrid>
-        <w:gridCol w:w="2642"/>
-        <w:gridCol w:w="2642"/>
-        <w:gridCol w:w="2642"/>
-        <w:gridCol w:w="2642"/>
-      </w:tblGrid>
-      <w:tr>
-        <w:tc>
-          <w:tcPr>
-            <w:tcW w:type="dxa" w:w="1512"/>
-            <w:vAlign w:val="center"/>
-            <w:tcMar>
-              <w:top w:w="55" w:type="dxa"/>
-              <w:start w:w="65" w:type="dxa"/>
-              <w:bottom w:w="55" w:type="dxa"/>
-              <w:end w:w="65" w:type="dxa"/>
-            </w:tcMar>
-            <w:tcBorders>
-              <w:top w:val="single" w:sz="4" w:color="D9D9D9"/>
-              <w:left w:val="single" w:sz="4" w:color="D9D9D9"/>
-              <w:bottom w:val="single" w:sz="4" w:color="D9D9D9"/>
-              <w:right w:val="single" w:sz="4" w:color="D9D9D9"/>
-              <w:insideH w:val="single" w:sz="4" w:color="D9D9D9"/>
-              <w:insideV w:val="single" w:sz="4" w:color="D9D9D9"/>
-            </w:tcBorders>
-            <w:shd w:fill="17365D"/>
-          </w:tcPr>
-          <w:p>
-            <w:pPr>
-              <w:spacing w:after="0"/>
-              <w:jc w:val="left"/>
-            </w:pPr>
-            <w:r>
-              <w:rPr>
-                <w:rFonts w:ascii="Arial" w:hAnsi="Arial"/>
-                <w:b/>
-                <w:color w:val="FFFFFF"/>
-                <w:sz w:val="14"/>
-              </w:rPr>
-              <w:t>Study</w:t>
-            </w:r>
-          </w:p>
-        </w:tc>
-        <w:tc>
-          <w:tcPr>
-            <w:tcW w:type="dxa" w:w="2088"/>
-            <w:vAlign w:val="center"/>
-            <w:tcMar>
-              <w:top w:w="55" w:type="dxa"/>
-              <w:start w:w="65" w:type="dxa"/>
-              <w:bottom w:w="55" w:type="dxa"/>
-              <w:end w:w="65" w:type="dxa"/>
-            </w:tcMar>
-            <w:tcBorders>
-              <w:top w:val="single" w:sz="4" w:color="D9D9D9"/>
-              <w:left w:val="single" w:sz="4" w:color="D9D9D9"/>
-              <w:bottom w:val="single" w:sz="4" w:color="D9D9D9"/>
-              <w:right w:val="single" w:sz="4" w:color="D9D9D9"/>
-              <w:insideH w:val="single" w:sz="4" w:color="D9D9D9"/>
-              <w:insideV w:val="single" w:sz="4" w:color="D9D9D9"/>
-            </w:tcBorders>
-            <w:shd w:fill="17365D"/>
-          </w:tcPr>
-          <w:p>
-            <w:pPr>
-              <w:spacing w:after="0"/>
-              <w:jc w:val="center"/>
-            </w:pPr>
-            <w:r>
-              <w:rPr>
-                <w:rFonts w:ascii="Arial" w:hAnsi="Arial"/>
-                <w:b/>
-                <w:color w:val="FFFFFF"/>
-                <w:sz w:val="14"/>
-              </w:rPr>
-              <w:t>Data and scope</w:t>
-            </w:r>
-          </w:p>
-        </w:tc>
-        <w:tc>
-          <w:tcPr>
-            <w:tcW w:type="dxa" w:w="2664"/>
-            <w:vAlign w:val="center"/>
-            <w:tcMar>
-              <w:top w:w="55" w:type="dxa"/>
-              <w:start w:w="65" w:type="dxa"/>
-              <w:bottom w:w="55" w:type="dxa"/>
-              <w:end w:w="65" w:type="dxa"/>
-            </w:tcMar>
-            <w:tcBorders>
-              <w:top w:val="single" w:sz="4" w:color="D9D9D9"/>
-              <w:left w:val="single" w:sz="4" w:color="D9D9D9"/>
-              <w:bottom w:val="single" w:sz="4" w:color="D9D9D9"/>
-              <w:right w:val="single" w:sz="4" w:color="D9D9D9"/>
-              <w:insideH w:val="single" w:sz="4" w:color="D9D9D9"/>
-              <w:insideV w:val="single" w:sz="4" w:color="D9D9D9"/>
-            </w:tcBorders>
-            <w:shd w:fill="17365D"/>
-          </w:tcPr>
-          <w:p>
-            <w:pPr>
-              <w:spacing w:after="0"/>
-              <w:jc w:val="center"/>
-            </w:pPr>
-            <w:r>
-              <w:rPr>
-                <w:rFonts w:ascii="Arial" w:hAnsi="Arial"/>
-                <w:b/>
-                <w:color w:val="FFFFFF"/>
-                <w:sz w:val="14"/>
-              </w:rPr>
-              <w:t>Models and tasks</w:t>
-            </w:r>
-          </w:p>
-        </w:tc>
-        <w:tc>
-          <w:tcPr>
-            <w:tcW w:type="dxa" w:w="4104"/>
-            <w:vAlign w:val="center"/>
-            <w:tcMar>
-              <w:top w:w="55" w:type="dxa"/>
-              <w:start w:w="65" w:type="dxa"/>
-              <w:bottom w:w="55" w:type="dxa"/>
-              <w:end w:w="65" w:type="dxa"/>
-            </w:tcMar>
-            <w:tcBorders>
-              <w:top w:val="single" w:sz="4" w:color="D9D9D9"/>
-              <w:left w:val="single" w:sz="4" w:color="D9D9D9"/>
-              <w:bottom w:val="single" w:sz="4" w:color="D9D9D9"/>
-              <w:right w:val="single" w:sz="4" w:color="D9D9D9"/>
-              <w:insideH w:val="single" w:sz="4" w:color="D9D9D9"/>
-              <w:insideV w:val="single" w:sz="4" w:color="D9D9D9"/>
-            </w:tcBorders>
-            <w:shd w:fill="17365D"/>
-          </w:tcPr>
-          <w:p>
-            <w:pPr>
-              <w:spacing w:after="0"/>
-              <w:jc w:val="center"/>
-            </w:pPr>
-            <w:r>
-              <w:rPr>
-                <w:rFonts w:ascii="Arial" w:hAnsi="Arial"/>
-                <w:b/>
-                <w:color w:val="FFFFFF"/>
-                <w:sz w:val="14"/>
-              </w:rPr>
-              <w:t>Difference in our study</w:t>
-            </w:r>
-          </w:p>
-        </w:tc>
-      </w:tr>
-      <w:tr>
-        <w:tc>
-          <w:tcPr>
-            <w:tcW w:type="dxa" w:w="1512"/>
-            <w:vAlign w:val="center"/>
-            <w:tcMar>
-              <w:top w:w="55" w:type="dxa"/>
-              <w:start w:w="65" w:type="dxa"/>
-              <w:bottom w:w="55" w:type="dxa"/>
-              <w:end w:w="65" w:type="dxa"/>
-            </w:tcMar>
-            <w:tcBorders>
-              <w:top w:val="single" w:sz="4" w:color="D9D9D9"/>
-              <w:left w:val="single" w:sz="4" w:color="D9D9D9"/>
-              <w:bottom w:val="single" w:sz="4" w:color="D9D9D9"/>
-              <w:right w:val="single" w:sz="4" w:color="D9D9D9"/>
-              <w:insideH w:val="single" w:sz="4" w:color="D9D9D9"/>
-              <w:insideV w:val="single" w:sz="4" w:color="D9D9D9"/>
-            </w:tcBorders>
-          </w:tcPr>
-          <w:p>
-            <w:pPr>
-              <w:spacing w:after="0"/>
-              <w:jc w:val="left"/>
-            </w:pPr>
-            <w:r>
-              <w:rPr>
-                <w:rFonts w:ascii="Arial" w:hAnsi="Arial"/>
-                <w:sz w:val="14"/>
-              </w:rPr>
-              <w:t>Rojas et al. (2022)</w:t>
-            </w:r>
-          </w:p>
-        </w:tc>
-        <w:tc>
-          <w:tcPr>
-            <w:tcW w:type="dxa" w:w="2088"/>
-            <w:vAlign w:val="center"/>
-            <w:tcMar>
-              <w:top w:w="55" w:type="dxa"/>
-              <w:start w:w="65" w:type="dxa"/>
-              <w:bottom w:w="55" w:type="dxa"/>
-              <w:end w:w="65" w:type="dxa"/>
-            </w:tcMar>
-            <w:tcBorders>
-              <w:top w:val="single" w:sz="4" w:color="D9D9D9"/>
-              <w:left w:val="single" w:sz="4" w:color="D9D9D9"/>
-              <w:bottom w:val="single" w:sz="4" w:color="D9D9D9"/>
-              <w:right w:val="single" w:sz="4" w:color="D9D9D9"/>
-              <w:insideH w:val="single" w:sz="4" w:color="D9D9D9"/>
-              <w:insideV w:val="single" w:sz="4" w:color="D9D9D9"/>
-            </w:tcBorders>
-          </w:tcPr>
-          <w:p>
-            <w:pPr>
-              <w:spacing w:after="0"/>
-              <w:jc w:val="center"/>
-            </w:pPr>
-            <w:r>
-              <w:rPr>
-                <w:rFonts w:ascii="Arial" w:hAnsi="Arial"/>
-                <w:sz w:val="14"/>
-              </w:rPr>
-              <w:t>Full Dollar Street dataset</w:t>
-            </w:r>
-          </w:p>
-        </w:tc>
-        <w:tc>
-          <w:tcPr>
-            <w:tcW w:type="dxa" w:w="2664"/>
-            <w:vAlign w:val="center"/>
-            <w:tcMar>
-              <w:top w:w="55" w:type="dxa"/>
-              <w:start w:w="65" w:type="dxa"/>
-              <w:bottom w:w="55" w:type="dxa"/>
-              <w:end w:w="65" w:type="dxa"/>
-            </w:tcMar>
-            <w:tcBorders>
-              <w:top w:val="single" w:sz="4" w:color="D9D9D9"/>
-              <w:left w:val="single" w:sz="4" w:color="D9D9D9"/>
-              <w:bottom w:val="single" w:sz="4" w:color="D9D9D9"/>
-              <w:right w:val="single" w:sz="4" w:color="D9D9D9"/>
-              <w:insideH w:val="single" w:sz="4" w:color="D9D9D9"/>
-              <w:insideV w:val="single" w:sz="4" w:color="D9D9D9"/>
-            </w:tcBorders>
-          </w:tcPr>
-          <w:p>
-            <w:pPr>
-              <w:spacing w:after="0"/>
-              <w:jc w:val="center"/>
-            </w:pPr>
-            <w:r>
-              <w:rPr>
-                <w:rFonts w:ascii="Arial" w:hAnsi="Arial"/>
-                <w:sz w:val="14"/>
-              </w:rPr>
-              <w:t>Dataset benchmarks</w:t>
-            </w:r>
-          </w:p>
-        </w:tc>
-        <w:tc>
-          <w:tcPr>
-            <w:tcW w:type="dxa" w:w="4104"/>
-            <w:vAlign w:val="center"/>
-            <w:tcMar>
-              <w:top w:w="55" w:type="dxa"/>
-              <w:start w:w="65" w:type="dxa"/>
-              <w:bottom w:w="55" w:type="dxa"/>
-              <w:end w:w="65" w:type="dxa"/>
-            </w:tcMar>
-            <w:tcBorders>
-              <w:top w:val="single" w:sz="4" w:color="D9D9D9"/>
-              <w:left w:val="single" w:sz="4" w:color="D9D9D9"/>
-              <w:bottom w:val="single" w:sz="4" w:color="D9D9D9"/>
-              <w:right w:val="single" w:sz="4" w:color="D9D9D9"/>
-              <w:insideH w:val="single" w:sz="4" w:color="D9D9D9"/>
-              <w:insideV w:val="single" w:sz="4" w:color="D9D9D9"/>
-            </w:tcBorders>
-          </w:tcPr>
-          <w:p>
-            <w:pPr>
-              <w:spacing w:after="0"/>
-              <w:jc w:val="center"/>
-            </w:pPr>
-            <w:r>
-              <w:rPr>
-                <w:rFonts w:ascii="Arial" w:hAnsi="Arial"/>
-                <w:sz w:val="14"/>
-              </w:rPr>
-              <w:t>We use a fixed, category-balanced evaluation subset.</w:t>
-            </w:r>
-          </w:p>
-        </w:tc>
-      </w:tr>
-      <w:tr>
-        <w:tc>
-          <w:tcPr>
-            <w:tcW w:type="dxa" w:w="1512"/>
-            <w:vAlign w:val="center"/>
-            <w:tcMar>
-              <w:top w:w="55" w:type="dxa"/>
-              <w:start w:w="65" w:type="dxa"/>
-              <w:bottom w:w="55" w:type="dxa"/>
-              <w:end w:w="65" w:type="dxa"/>
-            </w:tcMar>
-            <w:tcBorders>
-              <w:top w:val="single" w:sz="4" w:color="D9D9D9"/>
-              <w:left w:val="single" w:sz="4" w:color="D9D9D9"/>
-              <w:bottom w:val="single" w:sz="4" w:color="D9D9D9"/>
-              <w:right w:val="single" w:sz="4" w:color="D9D9D9"/>
-              <w:insideH w:val="single" w:sz="4" w:color="D9D9D9"/>
-              <w:insideV w:val="single" w:sz="4" w:color="D9D9D9"/>
-            </w:tcBorders>
-            <w:shd w:fill="EAF1F8"/>
-          </w:tcPr>
-          <w:p>
-            <w:pPr>
-              <w:spacing w:after="0"/>
-              <w:jc w:val="left"/>
-            </w:pPr>
-            <w:r>
-              <w:rPr>
-                <w:rFonts w:ascii="Arial" w:hAnsi="Arial"/>
-                <w:sz w:val="14"/>
-              </w:rPr>
-              <w:t>Nwatu et al. (2023)</w:t>
-            </w:r>
-          </w:p>
-        </w:tc>
-        <w:tc>
-          <w:tcPr>
-            <w:tcW w:type="dxa" w:w="2088"/>
-            <w:vAlign w:val="center"/>
-            <w:tcMar>
-              <w:top w:w="55" w:type="dxa"/>
-              <w:start w:w="65" w:type="dxa"/>
-              <w:bottom w:w="55" w:type="dxa"/>
-              <w:end w:w="65" w:type="dxa"/>
-            </w:tcMar>
-            <w:tcBorders>
-              <w:top w:val="single" w:sz="4" w:color="D9D9D9"/>
-              <w:left w:val="single" w:sz="4" w:color="D9D9D9"/>
-              <w:bottom w:val="single" w:sz="4" w:color="D9D9D9"/>
-              <w:right w:val="single" w:sz="4" w:color="D9D9D9"/>
-              <w:insideH w:val="single" w:sz="4" w:color="D9D9D9"/>
-              <w:insideV w:val="single" w:sz="4" w:color="D9D9D9"/>
-            </w:tcBorders>
-            <w:shd w:fill="EAF1F8"/>
-          </w:tcPr>
-          <w:p>
-            <w:pPr>
-              <w:spacing w:after="0"/>
-              <w:jc w:val="center"/>
-            </w:pPr>
-            <w:r>
-              <w:rPr>
-                <w:rFonts w:ascii="Arial" w:hAnsi="Arial"/>
-                <w:sz w:val="14"/>
-              </w:rPr>
-              <w:t>Dollar Street income ranges</w:t>
-            </w:r>
-          </w:p>
-        </w:tc>
-        <w:tc>
-          <w:tcPr>
-            <w:tcW w:type="dxa" w:w="2664"/>
-            <w:vAlign w:val="center"/>
-            <w:tcMar>
-              <w:top w:w="55" w:type="dxa"/>
-              <w:start w:w="65" w:type="dxa"/>
-              <w:bottom w:w="55" w:type="dxa"/>
-              <w:end w:w="65" w:type="dxa"/>
-            </w:tcMar>
-            <w:tcBorders>
-              <w:top w:val="single" w:sz="4" w:color="D9D9D9"/>
-              <w:left w:val="single" w:sz="4" w:color="D9D9D9"/>
-              <w:bottom w:val="single" w:sz="4" w:color="D9D9D9"/>
-              <w:right w:val="single" w:sz="4" w:color="D9D9D9"/>
-              <w:insideH w:val="single" w:sz="4" w:color="D9D9D9"/>
-              <w:insideV w:val="single" w:sz="4" w:color="D9D9D9"/>
-            </w:tcBorders>
-            <w:shd w:fill="EAF1F8"/>
-          </w:tcPr>
-          <w:p>
-            <w:pPr>
-              <w:spacing w:after="0"/>
-              <w:jc w:val="center"/>
-            </w:pPr>
-            <w:r>
-              <w:rPr>
-                <w:rFonts w:ascii="Arial" w:hAnsi="Arial"/>
-                <w:sz w:val="14"/>
-              </w:rPr>
-              <w:t>CLIP alignment and retrieval</w:t>
-            </w:r>
-          </w:p>
-        </w:tc>
-        <w:tc>
-          <w:tcPr>
-            <w:tcW w:type="dxa" w:w="4104"/>
-            <w:vAlign w:val="center"/>
-            <w:tcMar>
-              <w:top w:w="55" w:type="dxa"/>
-              <w:start w:w="65" w:type="dxa"/>
-              <w:bottom w:w="55" w:type="dxa"/>
-              <w:end w:w="65" w:type="dxa"/>
-            </w:tcMar>
-            <w:tcBorders>
-              <w:top w:val="single" w:sz="4" w:color="D9D9D9"/>
-              <w:left w:val="single" w:sz="4" w:color="D9D9D9"/>
-              <w:bottom w:val="single" w:sz="4" w:color="D9D9D9"/>
-              <w:right w:val="single" w:sz="4" w:color="D9D9D9"/>
-              <w:insideH w:val="single" w:sz="4" w:color="D9D9D9"/>
-              <w:insideV w:val="single" w:sz="4" w:color="D9D9D9"/>
-            </w:tcBorders>
-            <w:shd w:fill="EAF1F8"/>
-          </w:tcPr>
-          <w:p>
-            <w:pPr>
-              <w:spacing w:after="0"/>
-              <w:jc w:val="center"/>
-            </w:pPr>
-            <w:r>
-              <w:rPr>
-                <w:rFonts w:ascii="Arial" w:hAnsi="Arial"/>
-                <w:sz w:val="14"/>
-              </w:rPr>
-              <w:t>We compare five models across recognition, captioning, and detection.</w:t>
-            </w:r>
-          </w:p>
-        </w:tc>
-      </w:tr>
-      <w:tr>
-        <w:tc>
-          <w:tcPr>
-            <w:tcW w:type="dxa" w:w="1512"/>
-            <w:vAlign w:val="center"/>
-            <w:tcMar>
-              <w:top w:w="55" w:type="dxa"/>
-              <w:start w:w="65" w:type="dxa"/>
-              <w:bottom w:w="55" w:type="dxa"/>
-              <w:end w:w="65" w:type="dxa"/>
-            </w:tcMar>
-            <w:tcBorders>
-              <w:top w:val="single" w:sz="4" w:color="D9D9D9"/>
-              <w:left w:val="single" w:sz="4" w:color="D9D9D9"/>
-              <w:bottom w:val="single" w:sz="4" w:color="D9D9D9"/>
-              <w:right w:val="single" w:sz="4" w:color="D9D9D9"/>
-              <w:insideH w:val="single" w:sz="4" w:color="D9D9D9"/>
-              <w:insideV w:val="single" w:sz="4" w:color="D9D9D9"/>
-            </w:tcBorders>
-          </w:tcPr>
-          <w:p>
-            <w:pPr>
-              <w:spacing w:after="0"/>
-              <w:jc w:val="left"/>
-            </w:pPr>
-            <w:r>
-              <w:rPr>
-                <w:rFonts w:ascii="Arial" w:hAnsi="Arial"/>
-                <w:sz w:val="14"/>
-              </w:rPr>
-              <w:t>This work</w:t>
-            </w:r>
-          </w:p>
-        </w:tc>
-        <w:tc>
-          <w:tcPr>
-            <w:tcW w:type="dxa" w:w="2088"/>
-            <w:vAlign w:val="center"/>
-            <w:tcMar>
-              <w:top w:w="55" w:type="dxa"/>
-              <w:start w:w="65" w:type="dxa"/>
-              <w:bottom w:w="55" w:type="dxa"/>
-              <w:end w:w="65" w:type="dxa"/>
-            </w:tcMar>
-            <w:tcBorders>
-              <w:top w:val="single" w:sz="4" w:color="D9D9D9"/>
-              <w:left w:val="single" w:sz="4" w:color="D9D9D9"/>
-              <w:bottom w:val="single" w:sz="4" w:color="D9D9D9"/>
-              <w:right w:val="single" w:sz="4" w:color="D9D9D9"/>
-              <w:insideH w:val="single" w:sz="4" w:color="D9D9D9"/>
-              <w:insideV w:val="single" w:sz="4" w:color="D9D9D9"/>
-            </w:tcBorders>
-          </w:tcPr>
-          <w:p>
-            <w:pPr>
-              <w:spacing w:after="0"/>
-              <w:jc w:val="center"/>
-            </w:pPr>
-            <w:r>
-              <w:rPr>
-                <w:rFonts w:ascii="Arial" w:hAnsi="Arial"/>
-                <w:sz w:val="14"/>
-              </w:rPr>
-              <w:t>168 images; 24 balanced cells</w:t>
-            </w:r>
-          </w:p>
-        </w:tc>
-        <w:tc>
-          <w:tcPr>
-            <w:tcW w:type="dxa" w:w="2664"/>
-            <w:vAlign w:val="center"/>
-            <w:tcMar>
-              <w:top w:w="55" w:type="dxa"/>
-              <w:start w:w="65" w:type="dxa"/>
-              <w:bottom w:w="55" w:type="dxa"/>
-              <w:end w:w="65" w:type="dxa"/>
-            </w:tcMar>
-            <w:tcBorders>
-              <w:top w:val="single" w:sz="4" w:color="D9D9D9"/>
-              <w:left w:val="single" w:sz="4" w:color="D9D9D9"/>
-              <w:bottom w:val="single" w:sz="4" w:color="D9D9D9"/>
-              <w:right w:val="single" w:sz="4" w:color="D9D9D9"/>
-              <w:insideH w:val="single" w:sz="4" w:color="D9D9D9"/>
-              <w:insideV w:val="single" w:sz="4" w:color="D9D9D9"/>
-            </w:tcBorders>
-          </w:tcPr>
-          <w:p>
-            <w:pPr>
-              <w:spacing w:after="0"/>
-              <w:jc w:val="center"/>
-            </w:pPr>
-            <w:r>
-              <w:rPr>
-                <w:rFonts w:ascii="Arial" w:hAnsi="Arial"/>
-                <w:sz w:val="14"/>
-              </w:rPr>
-              <w:t>CLIP, BLIP, Qwen, InternVL, YOLO-World</w:t>
-            </w:r>
-          </w:p>
-        </w:tc>
-        <w:tc>
-          <w:tcPr>
-            <w:tcW w:type="dxa" w:w="4104"/>
-            <w:vAlign w:val="center"/>
-            <w:tcMar>
-              <w:top w:w="55" w:type="dxa"/>
-              <w:start w:w="65" w:type="dxa"/>
-              <w:bottom w:w="55" w:type="dxa"/>
-              <w:end w:w="65" w:type="dxa"/>
-            </w:tcMar>
-            <w:tcBorders>
-              <w:top w:val="single" w:sz="4" w:color="D9D9D9"/>
-              <w:left w:val="single" w:sz="4" w:color="D9D9D9"/>
-              <w:bottom w:val="single" w:sz="4" w:color="D9D9D9"/>
-              <w:right w:val="single" w:sz="4" w:color="D9D9D9"/>
-              <w:insideH w:val="single" w:sz="4" w:color="D9D9D9"/>
-              <w:insideV w:val="single" w:sz="4" w:color="D9D9D9"/>
-            </w:tcBorders>
-          </w:tcPr>
-          <w:p>
-            <w:pPr>
-              <w:spacing w:after="0"/>
-              <w:jc w:val="center"/>
-            </w:pPr>
-            <w:r>
-              <w:rPr>
-                <w:rFonts w:ascii="Arial" w:hAnsi="Arial"/>
-                <w:sz w:val="14"/>
-              </w:rPr>
-              <w:t>We add cross-model gaps, human caption review, failure cases, and a demo.</w:t>
-            </w:r>
-          </w:p>
-        </w:tc>
-      </w:tr>
-    </w:tbl>
-    <w:p>
-      <w:pPr>
-        <w:spacing w:after="0"/>
-      </w:pPr>
-    </w:p>
-    <w:p>
-      <w:pPr>
-        <w:keepLines w:val="0"/>
-        <w:spacing w:after="50" w:line="240" w:lineRule="auto"/>
-        <w:jc w:val="both"/>
-      </w:pPr>
-      <w:r>
-        <w:rPr>
-          <w:i/>
-        </w:rPr>
-        <w:t>Table 2. Positioning against the closest Dollar Street studies.</w:t>
-      </w:r>
-    </w:p>
-    <w:p>
-      <w:pPr>
-        <w:pStyle w:val="Heading2"/>
+        <w:pStyle w:val="Heading1"/>
       </w:pPr>
       <w:r>
         <w:t>References</w:t>

</xml_diff>

<commit_message>
Complete final rubric-aligned report
</commit_message>
<xml_diff>
--- a/output/Income_Gaps_VLM_Short_Paper.docx
+++ b/output/Income_Gaps_VLM_Short_Paper.docx
@@ -152,7 +152,7 @@
         <w:rPr>
           <w:i w:val="0"/>
         </w:rPr>
-        <w:t>Classification uses top-1 accuracy. Caption recall checks for a predefined category term or synonym with whole-term matching. Two raters independently reviewed all 336 BLIP captions for object correctness, non-informativeness, and hallucination, and then resolved disagreements. We report raw agreement and Cohen's kappa. A fixed 84-image sample was also used to check Qwen captions. The main gap is Q4 minus Q1, with a 95% category-stratified bootstrap interval from 2,000 resamples using seed 2026. We verified all 1,344 prediction rows for coverage, duplicate keys, and missing metrics.</w:t>
+        <w:t>Classification uses top-1 accuracy. Caption recall checks for a predefined category term or synonym with whole-term matching. Two raters independently reviewed all 336 BLIP captions for object correctness, non-informativeness, and hallucination, and then resolved disagreements. We report raw agreement and Cohen's kappa. A separate one-rater check used a fixed 84-image sample for Qwen captions. The main gap is Q4 minus Q1, with a 95% category-stratified bootstrap interval from 2,000 resamples using seed 2026. We verified all 1,344 prediction rows for coverage, duplicate keys, and missing metrics.</w:t>
       </w:r>
     </w:p>
     <w:p>
@@ -2115,7 +2115,7 @@
         <w:rPr>
           <w:i w:val="0"/>
         </w:rPr>
-        <w:t>Automatic caption recall was higher in Q4 than Q1 for every captioning condition. The gaps were 47.6 points for unprompted BLIP, 52.4 for prompted BLIP, 45.2 for Qwen, and 21.4 for InternVL. Manual review gave a different view of BLIP. Object correctness was 80.4% without the prompt and 83.9% with it, compared with automatic recall of 53.0% and 51.2%. The prompt reduced automatic recall by 1.8 points, but improved human-rated correctness by 3.6 points and reduced hallucinations from 16.7% to 12.5%. Object-correct agreement was 89.3% (kappa 0.65), and hallucination agreement was 94.0% (kappa 0.77). The term list missed reasonable descriptions such as *bucket* or *basket* for a trash container.</w:t>
+        <w:t>Automatic caption recall was higher in Q4 than Q1 for every captioning condition. The gaps were 47.6 points for unprompted BLIP, 52.4 for prompted BLIP, 45.2 for Qwen, and 21.4 for InternVL. Manual review gave a different view of BLIP. Object correctness was 80.4% without the prompt and 83.9% with it, compared with automatic recall of 53.0% and 51.2%. The prompt reduced automatic recall by 1.8 points, but improved human-rated correctness by 3.6 points and reduced hallucinations from 16.7% to 12.5%. Object-correct agreement was 89.3% (kappa 0.65), and hallucination agreement was 94.0% (kappa 0.77). In the separate Qwen sample, automatic recall was 57.1% and clear semantic recall was 70.2%; 11 of 84 captions remained uncertain. The term list missed reasonable descriptions such as bucket or basket for a trash container.</w:t>
       </w:r>
     </w:p>
     <w:p>

</xml_diff>